<commit_message>
Upload Update log File
</commit_message>
<xml_diff>
--- a/Planning Documents/User Research Plan.docx
+++ b/Planning Documents/User Research Plan.docx
@@ -134,15 +134,30 @@
       <w:pPr>
         <w:contextualSpacing w:val="0"/>
         <w:rPr>
+          <w:lang w:eastAsia="zh-TW"/>
+        </w:rPr>
+      </w:pPr>
+      <w:r>
+        <w:rPr>
+          <w:lang w:eastAsia="zh-TW"/>
+        </w:rPr>
+        <w:t>This document is based on G6078: Game Design and Development Assignment 2 – Report Template.</w:t>
+      </w:r>
+    </w:p>
+    <w:p>
+      <w:pPr>
+        <w:contextualSpacing w:val="0"/>
+        <w:rPr>
           <w:rFonts w:hint="eastAsia"/>
           <w:lang w:eastAsia="zh-TW"/>
         </w:rPr>
       </w:pPr>
       <w:r>
         <w:rPr>
+          <w:rFonts w:hint="eastAsia"/>
           <w:lang w:eastAsia="zh-TW"/>
         </w:rPr>
-        <w:t>This document is based on G6078: Game Design and Development Assignment 2 – Report Template.</w:t>
+        <w:t>08/03/2025</w:t>
       </w:r>
     </w:p>
     <w:p>
@@ -206,7 +221,6 @@
         <w:ind w:leftChars="0"/>
         <w:contextualSpacing w:val="0"/>
         <w:rPr>
-          <w:rFonts w:hint="eastAsia"/>
           <w:lang w:val="en-US" w:eastAsia="zh-TW"/>
         </w:rPr>
       </w:pPr>
@@ -307,7 +321,6 @@
         <w:ind w:leftChars="0"/>
         <w:contextualSpacing w:val="0"/>
         <w:rPr>
-          <w:rFonts w:hint="eastAsia"/>
           <w:lang w:val="en-US" w:eastAsia="zh-TW"/>
         </w:rPr>
       </w:pPr>
@@ -449,19 +462,7 @@
         <w:rPr>
           <w:lang w:val="en-US"/>
         </w:rPr>
-        <w:t xml:space="preserve">How well do players understand the </w:t>
-      </w:r>
-      <w:r>
-        <w:rPr>
-          <w:lang w:val="en-US"/>
-        </w:rPr>
-        <w:t>winning</w:t>
-      </w:r>
-      <w:r>
-        <w:rPr>
-          <w:lang w:val="en-US"/>
-        </w:rPr>
-        <w:t xml:space="preserve"> conditions and strategic paths to victory?</w:t>
+        <w:t>How well do players understand the winning conditions and strategic paths to victory?</w:t>
       </w:r>
     </w:p>
     <w:p>
@@ -474,16 +475,32 @@
         <w:ind w:leftChars="0"/>
         <w:contextualSpacing w:val="0"/>
         <w:rPr>
+          <w:lang w:val="en-US"/>
+        </w:rPr>
+      </w:pPr>
+      <w:r>
+        <w:rPr>
+          <w:lang w:val="en-US"/>
+        </w:rPr>
+        <w:t>Which game mode (full game, time-limited, abridged) provides the most satisfying experience?</w:t>
+      </w:r>
+    </w:p>
+    <w:p>
+      <w:pPr>
+        <w:contextualSpacing w:val="0"/>
+        <w:rPr>
+          <w:lang w:val="en-US" w:eastAsia="zh-TW"/>
+        </w:rPr>
+      </w:pPr>
+    </w:p>
+    <w:p>
+      <w:pPr>
+        <w:contextualSpacing w:val="0"/>
+        <w:rPr>
           <w:rFonts w:hint="eastAsia"/>
-          <w:lang w:val="en-US"/>
-        </w:rPr>
-      </w:pPr>
-      <w:r>
-        <w:rPr>
-          <w:lang w:val="en-US"/>
-        </w:rPr>
-        <w:t>Which game mode (full game, time-limited, abridged) provides the most satisfying experience?</w:t>
-      </w:r>
+          <w:lang w:val="en-US" w:eastAsia="zh-TW"/>
+        </w:rPr>
+      </w:pPr>
     </w:p>
     <w:p>
       <w:pPr>
@@ -492,13 +509,11 @@
           <w:ilvl w:val="0"/>
           <w:numId w:val="4"/>
         </w:numPr>
-        <w:rPr>
-          <w:rFonts w:hint="eastAsia"/>
-        </w:rPr>
       </w:pPr>
       <w:bookmarkStart w:id="2" w:name="_89bc49x3irl2" w:colFirst="0" w:colLast="0"/>
       <w:bookmarkEnd w:id="2"/>
       <w:r>
+        <w:lastRenderedPageBreak/>
         <w:t>Methods</w:t>
       </w:r>
     </w:p>
@@ -564,7 +579,6 @@
         <w:rPr>
           <w:lang w:val="en-US"/>
         </w:rPr>
-        <w:lastRenderedPageBreak/>
         <w:t>Post-play interviews to gather detailed feedback on specific features</w:t>
       </w:r>
     </w:p>
@@ -572,7 +586,6 @@
       <w:pPr>
         <w:contextualSpacing w:val="0"/>
         <w:rPr>
-          <w:rFonts w:hint="eastAsia"/>
           <w:lang w:eastAsia="zh-TW"/>
         </w:rPr>
       </w:pPr>
@@ -667,9 +680,6 @@
           <w:ilvl w:val="0"/>
           <w:numId w:val="4"/>
         </w:numPr>
-        <w:rPr>
-          <w:rFonts w:hint="eastAsia"/>
-        </w:rPr>
       </w:pPr>
       <w:r>
         <w:t>Ethics</w:t>
@@ -712,7 +722,6 @@
         <w:ind w:left="720"/>
         <w:contextualSpacing w:val="0"/>
         <w:rPr>
-          <w:rFonts w:hint="eastAsia"/>
           <w:lang w:val="en-US" w:eastAsia="zh-TW"/>
         </w:rPr>
       </w:pPr>
@@ -3201,6 +3210,7 @@
   <w:style w:type="character" w:default="1" w:styleId="a0">
     <w:name w:val="Default Paragraph Font"/>
     <w:uiPriority w:val="1"/>
+    <w:semiHidden/>
     <w:unhideWhenUsed/>
   </w:style>
   <w:style w:type="table" w:default="1" w:styleId="a1">

</xml_diff>